<commit_message>
annotation (contas_suspensas): classify 50 tweet pairs and update control table
</commit_message>
<xml_diff>
--- a/data/Controle_de_anotacoes.docx
+++ b/data/Controle_de_anotacoes.docx
@@ -2506,7 +2506,7 @@
               <w:rPr>
                 <w:rtl w:val="0"/>
               </w:rPr>
-              <w:t xml:space="preserve">0</w:t>
+              <w:t xml:space="preserve">50</w:t>
             </w:r>
           </w:p>
         </w:tc>
@@ -2665,45 +2665,45 @@
               <w:rPr>
                 <w:rtl w:val="0"/>
               </w:rPr>
+              <w:t xml:space="preserve">100</w:t>
+            </w:r>
+          </w:p>
+        </w:tc>
+        <w:tc>
+          <w:tcPr>
+            <w:shd w:fill="auto" w:val="clear"/>
+            <w:tcMar>
+              <w:top w:w="100.0" w:type="dxa"/>
+              <w:left w:w="100.0" w:type="dxa"/>
+              <w:bottom w:w="100.0" w:type="dxa"/>
+              <w:right w:w="100.0" w:type="dxa"/>
+            </w:tcMar>
+            <w:vAlign w:val="top"/>
+          </w:tcPr>
+          <w:p>
+            <w:pPr>
+              <w:keepNext w:val="0"/>
+              <w:keepLines w:val="0"/>
+              <w:pageBreakBefore w:val="0"/>
+              <w:widowControl w:val="0"/>
+              <w:pBdr>
+                <w:top w:space="0" w:sz="0" w:val="nil"/>
+                <w:left w:space="0" w:sz="0" w:val="nil"/>
+                <w:bottom w:space="0" w:sz="0" w:val="nil"/>
+                <w:right w:space="0" w:sz="0" w:val="nil"/>
+                <w:between w:space="0" w:sz="0" w:val="nil"/>
+              </w:pBdr>
+              <w:shd w:fill="auto" w:val="clear"/>
+              <w:spacing w:after="0" w:before="0" w:line="240" w:lineRule="auto"/>
+              <w:ind w:left="0" w:right="0" w:firstLine="0"/>
+              <w:jc w:val="center"/>
+              <w:rPr/>
+            </w:pPr>
+            <w:r>
+              <w:rPr>
+                <w:rtl w:val="0"/>
+              </w:rPr>
               <w:t xml:space="preserve">50</w:t>
-            </w:r>
-          </w:p>
-        </w:tc>
-        <w:tc>
-          <w:tcPr>
-            <w:shd w:fill="auto" w:val="clear"/>
-            <w:tcMar>
-              <w:top w:w="100.0" w:type="dxa"/>
-              <w:left w:w="100.0" w:type="dxa"/>
-              <w:bottom w:w="100.0" w:type="dxa"/>
-              <w:right w:w="100.0" w:type="dxa"/>
-            </w:tcMar>
-            <w:vAlign w:val="top"/>
-          </w:tcPr>
-          <w:p>
-            <w:pPr>
-              <w:keepNext w:val="0"/>
-              <w:keepLines w:val="0"/>
-              <w:pageBreakBefore w:val="0"/>
-              <w:widowControl w:val="0"/>
-              <w:pBdr>
-                <w:top w:space="0" w:sz="0" w:val="nil"/>
-                <w:left w:space="0" w:sz="0" w:val="nil"/>
-                <w:bottom w:space="0" w:sz="0" w:val="nil"/>
-                <w:right w:space="0" w:sz="0" w:val="nil"/>
-                <w:between w:space="0" w:sz="0" w:val="nil"/>
-              </w:pBdr>
-              <w:shd w:fill="auto" w:val="clear"/>
-              <w:spacing w:after="0" w:before="0" w:line="240" w:lineRule="auto"/>
-              <w:ind w:left="0" w:right="0" w:firstLine="0"/>
-              <w:jc w:val="center"/>
-              <w:rPr/>
-            </w:pPr>
-            <w:r>
-              <w:rPr>
-                <w:rtl w:val="0"/>
-              </w:rPr>
-              <w:t xml:space="preserve">0</w:t>
             </w:r>
           </w:p>
         </w:tc>
@@ -2900,7 +2900,7 @@
               <w:rPr>
                 <w:rtl w:val="0"/>
               </w:rPr>
-              <w:t xml:space="preserve">0</w:t>
+              <w:t xml:space="preserve">50</w:t>
             </w:r>
           </w:p>
         </w:tc>

</xml_diff>

<commit_message>
annotation (aborto): classify 50 tweet pairs [100-150]
</commit_message>
<xml_diff>
--- a/data/Controle_de_anotacoes.docx
+++ b/data/Controle_de_anotacoes.docx
@@ -96,6 +96,7 @@
                 <w:bCs/>
               </w:rPr>
             </w:pPr>
+            <w:proofErr w:type="spellStart"/>
             <w:r>
               <w:rPr>
                 <w:b/>
@@ -103,6 +104,7 @@
               </w:rPr>
               <w:t>Dataset</w:t>
             </w:r>
+            <w:proofErr w:type="spellEnd"/>
           </w:p>
         </w:tc>
         <w:tc>
@@ -436,9 +438,11 @@
               <w:spacing w:line="240" w:lineRule="auto"/>
               <w:jc w:val="center"/>
             </w:pPr>
+            <w:proofErr w:type="spellStart"/>
             <w:r>
               <w:t>Reply</w:t>
             </w:r>
+            <w:proofErr w:type="spellEnd"/>
           </w:p>
         </w:tc>
         <w:tc>
@@ -493,7 +497,13 @@
               <w:jc w:val="center"/>
             </w:pPr>
             <w:r>
-              <w:t>100</w:t>
+              <w:t>1</w:t>
+            </w:r>
+            <w:r>
+              <w:t>5</w:t>
+            </w:r>
+            <w:r>
+              <w:t>0</w:t>
             </w:r>
           </w:p>
         </w:tc>
@@ -635,7 +645,13 @@
               <w:jc w:val="center"/>
             </w:pPr>
             <w:r>
-              <w:t>100</w:t>
+              <w:t>1</w:t>
+            </w:r>
+            <w:r>
+              <w:t>5</w:t>
+            </w:r>
+            <w:r>
+              <w:t>0</w:t>
             </w:r>
           </w:p>
         </w:tc>
@@ -895,9 +911,11 @@
               <w:spacing w:line="240" w:lineRule="auto"/>
               <w:jc w:val="center"/>
             </w:pPr>
+            <w:proofErr w:type="spellStart"/>
             <w:r>
               <w:t>Reply</w:t>
             </w:r>
+            <w:proofErr w:type="spellEnd"/>
           </w:p>
         </w:tc>
         <w:tc>
@@ -1333,9 +1351,11 @@
               <w:spacing w:line="240" w:lineRule="auto"/>
               <w:jc w:val="center"/>
             </w:pPr>
+            <w:proofErr w:type="spellStart"/>
             <w:r>
               <w:t>Reply</w:t>
             </w:r>
+            <w:proofErr w:type="spellEnd"/>
           </w:p>
         </w:tc>
         <w:tc>
@@ -1785,9 +1805,11 @@
               <w:spacing w:line="240" w:lineRule="auto"/>
               <w:jc w:val="center"/>
             </w:pPr>
+            <w:proofErr w:type="spellStart"/>
             <w:r>
               <w:t>Reply</w:t>
             </w:r>
+            <w:proofErr w:type="spellEnd"/>
           </w:p>
         </w:tc>
         <w:tc>
@@ -1842,10 +1864,7 @@
               <w:jc w:val="center"/>
             </w:pPr>
             <w:r>
-              <w:t>10</w:t>
-            </w:r>
-            <w:r>
-              <w:t>0</w:t>
+              <w:t>100</w:t>
             </w:r>
           </w:p>
         </w:tc>
@@ -1987,10 +2006,7 @@
               <w:jc w:val="center"/>
             </w:pPr>
             <w:r>
-              <w:t>10</w:t>
-            </w:r>
-            <w:r>
-              <w:t>0</w:t>
+              <w:t>100</w:t>
             </w:r>
           </w:p>
         </w:tc>
@@ -2132,10 +2148,7 @@
               <w:jc w:val="center"/>
             </w:pPr>
             <w:r>
-              <w:t>10</w:t>
-            </w:r>
-            <w:r>
-              <w:t>0</w:t>
+              <w:t>100</w:t>
             </w:r>
           </w:p>
         </w:tc>
@@ -2173,14 +2186,27 @@
     <w:p/>
     <w:p/>
     <w:p>
+      <w:proofErr w:type="spellStart"/>
       <w:r>
-        <w:t xml:space="preserve">Obs: </w:t>
+        <w:t>Obs</w:t>
+      </w:r>
+      <w:proofErr w:type="spellEnd"/>
+      <w:r>
+        <w:t xml:space="preserve">: </w:t>
       </w:r>
     </w:p>
     <w:p/>
     <w:p>
       <w:r>
-        <w:t>18/05/26 - cloroquina replys 50 ao 100 possui muitos casos de conflitos (vale o registro)</w:t>
+        <w:t xml:space="preserve">18/05/26 - cloroquina </w:t>
+      </w:r>
+      <w:proofErr w:type="spellStart"/>
+      <w:r>
+        <w:t>replys</w:t>
+      </w:r>
+      <w:proofErr w:type="spellEnd"/>
+      <w:r>
+        <w:t xml:space="preserve"> 50 ao 100 possui muitos casos de conflitos (vale o registro)</w:t>
       </w:r>
     </w:p>
     <w:p>

</xml_diff>

<commit_message>
annotation (cloroquina_quotes): Classify 50 tweets pairs [100-150]
</commit_message>
<xml_diff>
--- a/data/Controle_de_anotacoes.docx
+++ b/data/Controle_de_anotacoes.docx
@@ -1884,7 +1884,7 @@
               <w:rPr>
                 <w:rtl w:val="0"/>
               </w:rPr>
-              <w:t xml:space="preserve">100</w:t>
+              <w:t xml:space="preserve">150</w:t>
             </w:r>
           </w:p>
         </w:tc>
@@ -2043,7 +2043,7 @@
               <w:rPr>
                 <w:rtl w:val="0"/>
               </w:rPr>
-              <w:t xml:space="preserve">100</w:t>
+              <w:t xml:space="preserve">150</w:t>
             </w:r>
           </w:p>
         </w:tc>

</xml_diff>